<commit_message>
Reports: prompt log as a numbered list
Co-Authored-By: Claude Opus 5.5 <noreply@anthropic.com>
</commit_message>
<xml_diff>
--- a/docs/Assignment3_Report.docx
+++ b/docs/Assignment3_Report.docx
@@ -18965,6 +18965,42 @@
                 <w:sz w:val="18"/>
               </w:rPr>
               <w:t>change the name of the model and give the report in .docx format</w:t>
+            </w:r>
+          </w:p>
+        </w:tc>
+      </w:tr>
+      <w:tr>
+        <w:tc>
+          <w:tcPr>
+            <w:tcW w:type="dxa" w:w="5103"/>
+          </w:tcPr>
+          <w:p>
+            <w:pPr>
+              <w:spacing w:after="0"/>
+            </w:pPr>
+            <w:r>
+              <w:rPr>
+                <w:b w:val="0"/>
+                <w:sz w:val="18"/>
+              </w:rPr>
+              <w:t>44</w:t>
+            </w:r>
+          </w:p>
+        </w:tc>
+        <w:tc>
+          <w:tcPr>
+            <w:tcW w:type="dxa" w:w="5103"/>
+          </w:tcPr>
+          <w:p>
+            <w:pPr>
+              <w:spacing w:after="0"/>
+            </w:pPr>
+            <w:r>
+              <w:rPr>
+                <w:b w:val="0"/>
+                <w:sz w:val="18"/>
+              </w:rPr>
+              <w:t>give the prpompts in list</w:t>
             </w:r>
           </w:p>
         </w:tc>

</xml_diff>